<commit_message>
Agrego ejercicios resueltos - Rodrigo Sarmiento
</commit_message>
<xml_diff>
--- a/Perfil profecional.docx
+++ b/Perfil profecional.docx
@@ -4,16 +4,22 @@
   <w:body>
     <w:p>
       <w:pPr>
-        <w:pStyle w:val="Ttulo1"/>
-        <w:jc w:val="both"/>
-      </w:pPr>
-      <w:r>
+        <w:pStyle w:val="Heading1"/>
+        <w:jc w:val="both"/>
+        <w:rPr>
+          <w:color w:val="FF0000"/>
+        </w:rPr>
+      </w:pPr>
+      <w:r>
+        <w:rPr>
+          <w:color w:val="FF0000"/>
+        </w:rPr>
         <w:t xml:space="preserve">PERFIL PROFESIONAL </w:t>
       </w:r>
     </w:p>
     <w:p>
       <w:pPr>
-        <w:pStyle w:val="Ttulo2"/>
+        <w:pStyle w:val="Heading2"/>
         <w:jc w:val="both"/>
       </w:pPr>
       <w:r>
@@ -25,68 +31,12 @@
         <w:jc w:val="both"/>
       </w:pPr>
       <w:r>
-        <w:t xml:space="preserve">La/El Técnica/o Superior en Ciencia de Datos e Inteligencia Artificial estará capacitada/o para realizar proyectos de innovación que involucren actividades tanto del campo de la Ciencia de Datos como de la IA. Estará calificada/o para pensar con criterio estadístico situaciones de trabajo que involucren una amplia cantidad de datos, comprendiendo el ciclo de trabajo de la Ciencia de Datos dentro de una organización o para un/a cliente/a particular. Para ello, deberá conocer las técnicas específicas para explorar, limpiar y preparar diversas fuentes de datos antes de su procesamiento. Por su formación podrá diseñar, desarrollar e implementar técnicas de Machine </w:t>
-      </w:r>
-      <w:proofErr w:type="spellStart"/>
-      <w:r>
-        <w:t>Learning</w:t>
-      </w:r>
-      <w:proofErr w:type="spellEnd"/>
-      <w:r>
-        <w:t xml:space="preserve"> (aprendizaje automático) para su utilización aplicada a través de modelos predictivos, sistemas de recomendación, </w:t>
-      </w:r>
-      <w:proofErr w:type="spellStart"/>
-      <w:r>
-        <w:t>scoring</w:t>
-      </w:r>
-      <w:proofErr w:type="spellEnd"/>
-      <w:r>
-        <w:t xml:space="preserve">, reconocimiento de segmentos y </w:t>
-      </w:r>
-      <w:proofErr w:type="spellStart"/>
-      <w:r>
-        <w:t>clusters</w:t>
-      </w:r>
-      <w:proofErr w:type="spellEnd"/>
-      <w:r>
-        <w:t xml:space="preserve">, entre otras. Para ello podrá construir secuencias de análisis utilizando vigorosas librerías de datos pudiendo, incluso, construir librerías propias para su aplicación en diferentes industrias. En el campo de la Inteligencia Artificial (IA), y a partir de los fundamentos de </w:t>
-      </w:r>
-      <w:proofErr w:type="spellStart"/>
-      <w:r>
-        <w:t>deep</w:t>
-      </w:r>
-      <w:proofErr w:type="spellEnd"/>
-      <w:r>
-        <w:t xml:space="preserve"> </w:t>
-      </w:r>
-      <w:proofErr w:type="spellStart"/>
-      <w:r>
-        <w:t>learning</w:t>
-      </w:r>
-      <w:proofErr w:type="spellEnd"/>
-      <w:r>
-        <w:t xml:space="preserve">, esta/e Técnica/e Superior podrá construir redes neuronales y liderar exitosamente proyectos de Machine </w:t>
-      </w:r>
-      <w:proofErr w:type="spellStart"/>
-      <w:r>
-        <w:t>Learning</w:t>
-      </w:r>
-      <w:proofErr w:type="spellEnd"/>
-      <w:r>
-        <w:t xml:space="preserve"> que permitan implementar visión por computadora y aplicarlas a datos de imágenes. También podrá aplicar IA para procesar audio y texto a partir de aplicaciones que permitan, por ejemplo, reconocimiento automático del habla, síntesis de música, </w:t>
-      </w:r>
-      <w:proofErr w:type="spellStart"/>
-      <w:r>
-        <w:t>chatbots</w:t>
-      </w:r>
-      <w:proofErr w:type="spellEnd"/>
-      <w:r>
-        <w:t xml:space="preserve">, traducción automática, comprensión del lenguaje natural, entre otras posibilidades. A partir de la consulta y la interpretación de las necesidades del/la cliente/a y/u organización, podrá implementar y modelar la solución, para lo cual realiza las tareas de programación y entrenamiento, pudiendo también realizar acciones de mantenimiento, mejoras y actualizaciones de soluciones. La/El Técnica/o Superior podrá participar activamente en el desarrollo colaborativo de proyectos de innovación, interactuando con actores relacionados o no con su disciplina, estableciendo el diálogo con especialistas del campo particular en el cual está inserto su proyecto de trabajo. Si bien la/el Técnica/o Superior en Ciencia de Datos e IA trabaja en la adquisición, captura, adecuación y disponibilidad de datos, una parte importante de su trabajo radica en la capacidad de diseñar visualizaciones de información acertadas y 8 comunicar eficazmente los hallazgos obtenidos, traduciéndolos de manera comprensible a los roles no especializados de la organización y/o clientes. Para poder desarrollar plenamente su profesionalidad, la/el Técnica/o Superior en Ciencia de Datos e Inteligencia Artificial tiene que poseer un conjunto de capacidades inherentes al nivel de educación superior que resultan transversales a todas sus funciones y tienen que ser desarrolladas durante el transcurso de su formación, entre ellas: </w:t>
-      </w:r>
-    </w:p>
-    <w:p>
-      <w:pPr>
-        <w:pStyle w:val="Prrafodelista"/>
+        <w:t xml:space="preserve">La/El Técnica/o Superior en Ciencia de Datos e Inteligencia Artificial estará capacitada/o para realizar proyectos de innovación que involucren actividades tanto del campo de la Ciencia de Datos como de la IA. Estará calificada/o para pensar con criterio estadístico situaciones de trabajo que involucren una amplia cantidad de datos, comprendiendo el ciclo de trabajo de la Ciencia de Datos dentro de una organización o para un/a cliente/a particular. Para ello, deberá conocer las técnicas específicas para explorar, limpiar y preparar diversas fuentes de datos antes de su procesamiento. Por su formación podrá diseñar, desarrollar e implementar técnicas de Machine Learning (aprendizaje automático) para su utilización aplicada a través de modelos predictivos, sistemas de recomendación, scoring, reconocimiento de segmentos y clusters, entre otras. Para ello podrá construir secuencias de análisis utilizando vigorosas librerías de datos pudiendo, incluso, construir librerías propias para su aplicación en diferentes industrias. En el campo de la Inteligencia Artificial (IA), y a partir de los fundamentos de deep learning, esta/e Técnica/e Superior podrá construir redes neuronales y liderar exitosamente proyectos de Machine Learning que permitan implementar visión por computadora y aplicarlas a datos de imágenes. También podrá aplicar IA para procesar audio y texto a partir de aplicaciones que permitan, por ejemplo, reconocimiento automático del habla, síntesis de música, chatbots, traducción automática, comprensión del lenguaje natural, entre otras posibilidades. A partir de la consulta y la interpretación de las necesidades del/la cliente/a y/u organización, podrá implementar y modelar la solución, para lo cual realiza las tareas de programación y entrenamiento, pudiendo también realizar acciones de mantenimiento, mejoras y actualizaciones de soluciones. La/El Técnica/o Superior podrá participar activamente en el desarrollo colaborativo de proyectos de innovación, interactuando con actores relacionados o no con su disciplina, estableciendo el diálogo con especialistas del campo particular en el cual está inserto su proyecto de trabajo. Si bien la/el Técnica/o Superior en Ciencia de Datos e IA trabaja en la adquisición, captura, adecuación y disponibilidad de datos, una parte importante de su trabajo radica en la capacidad de diseñar visualizaciones de información acertadas y 8 comunicar eficazmente los hallazgos obtenidos, traduciéndolos de manera comprensible a los roles no especializados de la organización y/o clientes. Para poder desarrollar plenamente su profesionalidad, la/el Técnica/o Superior en Ciencia de Datos e Inteligencia Artificial tiene que poseer un conjunto de capacidades inherentes al nivel de educación superior que resultan transversales a todas sus funciones y tienen que ser desarrolladas durante el transcurso de su formación, entre ellas: </w:t>
+      </w:r>
+    </w:p>
+    <w:p>
+      <w:pPr>
+        <w:pStyle w:val="ListParagraph"/>
         <w:numPr>
           <w:ilvl w:val="0"/>
           <w:numId w:val="1"/>
@@ -99,7 +49,7 @@
     </w:p>
     <w:p>
       <w:pPr>
-        <w:pStyle w:val="Prrafodelista"/>
+        <w:pStyle w:val="ListParagraph"/>
         <w:numPr>
           <w:ilvl w:val="0"/>
           <w:numId w:val="1"/>
@@ -112,7 +62,7 @@
     </w:p>
     <w:p>
       <w:pPr>
-        <w:pStyle w:val="Prrafodelista"/>
+        <w:pStyle w:val="ListParagraph"/>
         <w:numPr>
           <w:ilvl w:val="0"/>
           <w:numId w:val="1"/>
@@ -132,7 +82,7 @@
     </w:p>
     <w:p>
       <w:pPr>
-        <w:pStyle w:val="Prrafodelista"/>
+        <w:pStyle w:val="ListParagraph"/>
         <w:numPr>
           <w:ilvl w:val="0"/>
           <w:numId w:val="1"/>
@@ -145,7 +95,7 @@
     </w:p>
     <w:p>
       <w:pPr>
-        <w:pStyle w:val="Ttulo2"/>
+        <w:pStyle w:val="Heading2"/>
       </w:pPr>
       <w:r>
         <w:t xml:space="preserve">Funciones que ejerce la/el profesional </w:t>
@@ -162,7 +112,7 @@
     </w:p>
     <w:p>
       <w:pPr>
-        <w:pStyle w:val="Ttulo3"/>
+        <w:pStyle w:val="Heading3"/>
       </w:pPr>
       <w:r>
         <w:t>Diseñar el proyecto Comprende:</w:t>
@@ -170,7 +120,7 @@
     </w:p>
     <w:p>
       <w:pPr>
-        <w:pStyle w:val="Prrafodelista"/>
+        <w:pStyle w:val="ListParagraph"/>
         <w:numPr>
           <w:ilvl w:val="0"/>
           <w:numId w:val="1"/>
@@ -183,7 +133,7 @@
     </w:p>
     <w:p>
       <w:pPr>
-        <w:pStyle w:val="Prrafodelista"/>
+        <w:pStyle w:val="ListParagraph"/>
         <w:numPr>
           <w:ilvl w:val="0"/>
           <w:numId w:val="1"/>
@@ -196,7 +146,7 @@
     </w:p>
     <w:p>
       <w:pPr>
-        <w:pStyle w:val="Prrafodelista"/>
+        <w:pStyle w:val="ListParagraph"/>
         <w:numPr>
           <w:ilvl w:val="0"/>
           <w:numId w:val="1"/>
@@ -209,7 +159,7 @@
     </w:p>
     <w:p>
       <w:pPr>
-        <w:pStyle w:val="Prrafodelista"/>
+        <w:pStyle w:val="ListParagraph"/>
         <w:numPr>
           <w:ilvl w:val="0"/>
           <w:numId w:val="1"/>
@@ -222,7 +172,7 @@
     </w:p>
     <w:p>
       <w:pPr>
-        <w:pStyle w:val="Prrafodelista"/>
+        <w:pStyle w:val="ListParagraph"/>
         <w:numPr>
           <w:ilvl w:val="0"/>
           <w:numId w:val="1"/>
@@ -235,7 +185,7 @@
     </w:p>
     <w:p>
       <w:pPr>
-        <w:pStyle w:val="Prrafodelista"/>
+        <w:pStyle w:val="ListParagraph"/>
         <w:numPr>
           <w:ilvl w:val="0"/>
           <w:numId w:val="1"/>
@@ -248,7 +198,7 @@
     </w:p>
     <w:p>
       <w:pPr>
-        <w:pStyle w:val="Prrafodelista"/>
+        <w:pStyle w:val="ListParagraph"/>
         <w:numPr>
           <w:ilvl w:val="0"/>
           <w:numId w:val="1"/>
@@ -261,7 +211,7 @@
     </w:p>
     <w:p>
       <w:pPr>
-        <w:pStyle w:val="Prrafodelista"/>
+        <w:pStyle w:val="ListParagraph"/>
         <w:numPr>
           <w:ilvl w:val="0"/>
           <w:numId w:val="1"/>
@@ -274,7 +224,7 @@
     </w:p>
     <w:p>
       <w:pPr>
-        <w:pStyle w:val="Prrafodelista"/>
+        <w:pStyle w:val="ListParagraph"/>
         <w:numPr>
           <w:ilvl w:val="0"/>
           <w:numId w:val="1"/>
@@ -287,7 +237,7 @@
     </w:p>
     <w:p>
       <w:pPr>
-        <w:pStyle w:val="Prrafodelista"/>
+        <w:pStyle w:val="ListParagraph"/>
         <w:numPr>
           <w:ilvl w:val="0"/>
           <w:numId w:val="1"/>
@@ -314,7 +264,7 @@
       </w:pPr>
       <w:r>
         <w:rPr>
-          <w:rStyle w:val="Ttulo3Car"/>
+          <w:rStyle w:val="Heading3Char"/>
         </w:rPr>
         <w:t>Diseñar soluciones que involucren análisis de datos Comprende:</w:t>
       </w:r>
@@ -324,7 +274,7 @@
     </w:p>
     <w:p>
       <w:pPr>
-        <w:pStyle w:val="Prrafodelista"/>
+        <w:pStyle w:val="ListParagraph"/>
         <w:numPr>
           <w:ilvl w:val="0"/>
           <w:numId w:val="1"/>
@@ -337,7 +287,7 @@
     </w:p>
     <w:p>
       <w:pPr>
-        <w:pStyle w:val="Prrafodelista"/>
+        <w:pStyle w:val="ListParagraph"/>
         <w:numPr>
           <w:ilvl w:val="0"/>
           <w:numId w:val="1"/>
@@ -350,7 +300,7 @@
     </w:p>
     <w:p>
       <w:pPr>
-        <w:pStyle w:val="Prrafodelista"/>
+        <w:pStyle w:val="ListParagraph"/>
         <w:numPr>
           <w:ilvl w:val="0"/>
           <w:numId w:val="1"/>
@@ -364,7 +314,7 @@
     </w:p>
     <w:p>
       <w:pPr>
-        <w:pStyle w:val="Prrafodelista"/>
+        <w:pStyle w:val="ListParagraph"/>
         <w:numPr>
           <w:ilvl w:val="0"/>
           <w:numId w:val="1"/>
@@ -380,7 +330,7 @@
     </w:p>
     <w:p>
       <w:pPr>
-        <w:pStyle w:val="Prrafodelista"/>
+        <w:pStyle w:val="ListParagraph"/>
         <w:numPr>
           <w:ilvl w:val="0"/>
           <w:numId w:val="1"/>
@@ -393,7 +343,7 @@
     </w:p>
     <w:p>
       <w:pPr>
-        <w:pStyle w:val="Prrafodelista"/>
+        <w:pStyle w:val="ListParagraph"/>
         <w:numPr>
           <w:ilvl w:val="0"/>
           <w:numId w:val="1"/>
@@ -420,7 +370,7 @@
       </w:pPr>
       <w:r>
         <w:rPr>
-          <w:rStyle w:val="Ttulo3Car"/>
+          <w:rStyle w:val="Heading3Char"/>
         </w:rPr>
         <w:t>Desarrollar sistemas de inteligencia artificial, que además involucren Visión Artificial o Procesamiento de Habla Comprende:</w:t>
       </w:r>
@@ -430,7 +380,7 @@
     </w:p>
     <w:p>
       <w:pPr>
-        <w:pStyle w:val="Prrafodelista"/>
+        <w:pStyle w:val="ListParagraph"/>
         <w:numPr>
           <w:ilvl w:val="0"/>
           <w:numId w:val="1"/>
@@ -443,52 +393,28 @@
     </w:p>
     <w:p>
       <w:pPr>
-        <w:pStyle w:val="Prrafodelista"/>
-        <w:numPr>
-          <w:ilvl w:val="0"/>
-          <w:numId w:val="1"/>
-        </w:numPr>
-        <w:jc w:val="both"/>
-      </w:pPr>
-      <w:r>
-        <w:t xml:space="preserve">Diagnosticar errores en un sistema de machine </w:t>
-      </w:r>
-      <w:proofErr w:type="spellStart"/>
-      <w:r>
-        <w:t>learning</w:t>
-      </w:r>
-      <w:proofErr w:type="spellEnd"/>
-      <w:r>
-        <w:t xml:space="preserve"> y evaluar posibles cambios o actualizaciones del diseño</w:t>
-      </w:r>
-    </w:p>
-    <w:p>
-      <w:pPr>
-        <w:pStyle w:val="Prrafodelista"/>
-        <w:numPr>
-          <w:ilvl w:val="0"/>
-          <w:numId w:val="1"/>
-        </w:numPr>
-        <w:jc w:val="both"/>
-      </w:pPr>
-      <w:r>
-        <w:t xml:space="preserve">Testear la calidad de </w:t>
-      </w:r>
-      <w:proofErr w:type="spellStart"/>
-      <w:r>
-        <w:t>deep</w:t>
-      </w:r>
-      <w:proofErr w:type="spellEnd"/>
-      <w:r>
-        <w:t xml:space="preserve"> </w:t>
-      </w:r>
-      <w:proofErr w:type="spellStart"/>
-      <w:r>
-        <w:t>learning</w:t>
-      </w:r>
-      <w:proofErr w:type="spellEnd"/>
-      <w:r>
-        <w:t xml:space="preserve"> utilizado y de las aplicaciones desarrolladas. </w:t>
+        <w:pStyle w:val="ListParagraph"/>
+        <w:numPr>
+          <w:ilvl w:val="0"/>
+          <w:numId w:val="1"/>
+        </w:numPr>
+        <w:jc w:val="both"/>
+      </w:pPr>
+      <w:r>
+        <w:t>Diagnosticar errores en un sistema de machine learning y evaluar posibles cambios o actualizaciones del diseño</w:t>
+      </w:r>
+    </w:p>
+    <w:p>
+      <w:pPr>
+        <w:pStyle w:val="ListParagraph"/>
+        <w:numPr>
+          <w:ilvl w:val="0"/>
+          <w:numId w:val="1"/>
+        </w:numPr>
+        <w:jc w:val="both"/>
+      </w:pPr>
+      <w:r>
+        <w:t xml:space="preserve">Testear la calidad de deep learning utilizado y de las aplicaciones desarrolladas. </w:t>
       </w:r>
     </w:p>
     <w:p>
@@ -507,14 +433,14 @@
       </w:pPr>
       <w:r>
         <w:rPr>
-          <w:rStyle w:val="Ttulo3Car"/>
+          <w:rStyle w:val="Heading3Char"/>
         </w:rPr>
         <w:t>Realizar tareas de mantenimiento y optimización del sistema Comprende:</w:t>
       </w:r>
     </w:p>
     <w:p>
       <w:pPr>
-        <w:pStyle w:val="Prrafodelista"/>
+        <w:pStyle w:val="ListParagraph"/>
         <w:numPr>
           <w:ilvl w:val="0"/>
           <w:numId w:val="1"/>
@@ -527,7 +453,7 @@
     </w:p>
     <w:p>
       <w:pPr>
-        <w:pStyle w:val="Prrafodelista"/>
+        <w:pStyle w:val="ListParagraph"/>
         <w:numPr>
           <w:ilvl w:val="0"/>
           <w:numId w:val="1"/>
@@ -540,7 +466,7 @@
     </w:p>
     <w:p>
       <w:pPr>
-        <w:pStyle w:val="Prrafodelista"/>
+        <w:pStyle w:val="ListParagraph"/>
         <w:numPr>
           <w:ilvl w:val="0"/>
           <w:numId w:val="1"/>
@@ -553,7 +479,7 @@
     </w:p>
     <w:p>
       <w:pPr>
-        <w:pStyle w:val="Prrafodelista"/>
+        <w:pStyle w:val="ListParagraph"/>
         <w:numPr>
           <w:ilvl w:val="0"/>
           <w:numId w:val="1"/>
@@ -580,7 +506,7 @@
       </w:pPr>
       <w:r>
         <w:rPr>
-          <w:rStyle w:val="Ttulo3Car"/>
+          <w:rStyle w:val="Heading3Char"/>
         </w:rPr>
         <w:t>Organizar y gestionar proyectos</w:t>
       </w:r>
@@ -608,7 +534,7 @@
       </w:pPr>
       <w:r>
         <w:rPr>
-          <w:rStyle w:val="Ttulo2Car"/>
+          <w:rStyle w:val="Heading2Char"/>
         </w:rPr>
         <w:t>ÁREA OCUPACIONAL</w:t>
       </w:r>
@@ -622,37 +548,13 @@
         <w:jc w:val="both"/>
       </w:pPr>
       <w:r>
-        <w:t xml:space="preserve">La aparición de nuevas fuentes de datos de complejidad y volumen crecientes, junto con la creación de un cúmulo de métodos útiles para almacenarlos y extraer información de los mismos, dio lugar a lo que se conoce hoy en día como la Ciencia de los Datos. Este nuevo campo profesional abarca a todas las herramientas, tecnologías, métodos y sistemas requeridos para manejar grandes conjuntos de datos distribuidos, heterogéneos, diversos, tan grandes y complejos que no se pueden analizar con las herramientas y métodos tradicionales de procesamiento y administración de bases de datos. Estas incluyen nuevos algoritmos estadísticos y matemáticos, técnicas de predicción y métodos de modelado, métodos de encriptación, así como enfoques multidisciplinarios y nuevas tecnologías para la recopilación, almacenamiento, análisis e intercambio de datos e información. El universo de datos, extenso y complejo tal como se describe aquí, al tratarse de personas, debe contemplar la perspectiva de género con la finalidad que, la recopilación, el almacenamiento y el análisis de éstos, impacte favorablemente en el desarrollo y la autonomía económica de todas las personas de una comunidad. Siguiendo esta idea, debe incluir un sistema que contemple la diversidad en los géneros atendiendo que, los análisis y soluciones basados en datos, tienen, como se afirma, implicancias reales en la vida diaria de las personas. En la actualidad, se entrenan algoritmos de inteligencia artificial para automatizar la toma de decisiones como el acceso a créditos en los sistemas bancarios y/o se seleccionan perfiles para un puesto laboral. De modo que, si se reproducen sesgos de género a través de un sistema binario exclusivamente (V/M), las personas cuya identidad sexual </w:t>
-      </w:r>
-      <w:proofErr w:type="spellStart"/>
-      <w:r>
-        <w:t>autopercibida</w:t>
-      </w:r>
-      <w:proofErr w:type="spellEnd"/>
-      <w:r>
-        <w:t xml:space="preserve"> no esté contemplada en la base de datos construida, continuarán en situación de desventaja, en relación con los géneros que sí figuran en dicho sistema. Se refuerza la idea que, tal enfoque debe ser incluido en toda base de datos cuando es utilizada para el diseño de políticas públicas, como en el sistema de salud, justicia, educación, entre otros. Por todo ello, la Ciencia de Datos ocupa actualmente un lugar central en las organizaciones y adquiere un uso cada vez más intensivo en la toma de decisiones en</w:t>
+        <w:t>La aparición de nuevas fuentes de datos de complejidad y volumen crecientes, junto con la creación de un cúmulo de métodos útiles para almacenarlos y extraer información de los mismos, dio lugar a lo que se conoce hoy en día como la Ciencia de los Datos. Este nuevo campo profesional abarca a todas las herramientas, tecnologías, métodos y sistemas requeridos para manejar grandes conjuntos de datos distribuidos, heterogéneos, diversos, tan grandes y complejos que no se pueden analizar con las herramientas y métodos tradicionales de procesamiento y administración de bases de datos. Estas incluyen nuevos algoritmos estadísticos y matemáticos, técnicas de predicción y métodos de modelado, métodos de encriptación, así como enfoques multidisciplinarios y nuevas tecnologías para la recopilación, almacenamiento, análisis e intercambio de datos e información. El universo de datos, extenso y complejo tal como se describe aquí, al tratarse de personas, debe contemplar la perspectiva de género con la finalidad que, la recopilación, el almacenamiento y el análisis de éstos, impacte favorablemente en el desarrollo y la autonomía económica de todas las personas de una comunidad. Siguiendo esta idea, debe incluir un sistema que contemple la diversidad en los géneros atendiendo que, los análisis y soluciones basados en datos, tienen, como se afirma, implicancias reales en la vida diaria de las personas. En la actualidad, se entrenan algoritmos de inteligencia artificial para automatizar la toma de decisiones como el acceso a créditos en los sistemas bancarios y/o se seleccionan perfiles para un puesto laboral. De modo que, si se reproducen sesgos de género a través de un sistema binario exclusivamente (V/M), las personas cuya identidad sexual autopercibida no esté contemplada en la base de datos construida, continuarán en situación de desventaja, en relación con los géneros que sí figuran en dicho sistema. Se refuerza la idea que, tal enfoque debe ser incluido en toda base de datos cuando es utilizada para el diseño de políticas públicas, como en el sistema de salud, justicia, educación, entre otros. Por todo ello, la Ciencia de Datos ocupa actualmente un lugar central en las organizaciones y adquiere un uso cada vez más intensivo en la toma de decisiones en</w:t>
       </w:r>
       <w:r>
         <w:t xml:space="preserve"> </w:t>
       </w:r>
       <w:r>
-        <w:t xml:space="preserve">infinidad de sectores profesionales: salud, genética, agro, redes sociales, marketing, finanzas, banca, comercialización de productos y telefonía, entre otros. Dentro de la Ciencia de Datos se encuentran técnicas de diferentes áreas de estudio, incluyendo la Estadística y la Inteligencia Artificial (Aprendizaje Automático o Machine </w:t>
-      </w:r>
-      <w:proofErr w:type="spellStart"/>
-      <w:r>
-        <w:t>Learning</w:t>
-      </w:r>
-      <w:proofErr w:type="spellEnd"/>
-      <w:r>
-        <w:t xml:space="preserve">). Las/os especialistas en este campo se enfocan en la construcción y optimización de algoritmos de Deep </w:t>
-      </w:r>
-      <w:proofErr w:type="spellStart"/>
-      <w:r>
-        <w:t>Learning</w:t>
-      </w:r>
-      <w:proofErr w:type="spellEnd"/>
-      <w:r>
-        <w:t xml:space="preserve"> con el fin de emular las habilidades humanas básicas como visión, lenguaje, toma de decisiones, entre otras. En este campo de permanente avance, los proyectos de Visión Artificial se caracterizan por el análisis de imágenes a fin de detectar diversos patrones en las mismas y los de Procesamiento de Habla se enfocan en la interacción con los clientes. La/el Técnica/o Superior en Ciencia de Datos e Inteligencia Artificial podrá insertarse en organizaciones para coordinar equipos de trabajo y dirigir emprendimientos de pequeña o mediana envergadura de </w:t>
+        <w:t xml:space="preserve">infinidad de sectores profesionales: salud, genética, agro, redes sociales, marketing, finanzas, banca, comercialización de productos y telefonía, entre otros. Dentro de la Ciencia de Datos se encuentran técnicas de diferentes áreas de estudio, incluyendo la Estadística y la Inteligencia Artificial (Aprendizaje Automático o Machine Learning). Las/os especialistas en este campo se enfocan en la construcción y optimización de algoritmos de Deep Learning con el fin de emular las habilidades humanas básicas como visión, lenguaje, toma de decisiones, entre otras. En este campo de permanente avance, los proyectos de Visión Artificial se caracterizan por el análisis de imágenes a fin de detectar diversos patrones en las mismas y los de Procesamiento de Habla se enfocan en la interacción con los clientes. La/el Técnica/o Superior en Ciencia de Datos e Inteligencia Artificial podrá insertarse en organizaciones para coordinar equipos de trabajo y dirigir emprendimientos de pequeña o mediana envergadura de </w:t>
       </w:r>
       <w:r>
         <w:lastRenderedPageBreak/>
@@ -666,7 +568,7 @@
       </w:pPr>
       <w:r>
         <w:rPr>
-          <w:rStyle w:val="Ttulo2Car"/>
+          <w:rStyle w:val="Heading2Char"/>
         </w:rPr>
         <w:t>HABILITACIONES PROFESIONALES</w:t>
       </w:r>
@@ -1213,11 +1115,11 @@
     <w:name w:val="Normal"/>
     <w:qFormat/>
   </w:style>
-  <w:style w:type="paragraph" w:styleId="Ttulo1">
+  <w:style w:type="paragraph" w:styleId="Heading1">
     <w:name w:val="heading 1"/>
     <w:basedOn w:val="Normal"/>
     <w:next w:val="Normal"/>
-    <w:link w:val="Ttulo1Car"/>
+    <w:link w:val="Heading1Char"/>
     <w:uiPriority w:val="9"/>
     <w:qFormat/>
     <w:rsid w:val="00976E20"/>
@@ -1234,11 +1136,11 @@
       <w:szCs w:val="40"/>
     </w:rPr>
   </w:style>
-  <w:style w:type="paragraph" w:styleId="Ttulo2">
+  <w:style w:type="paragraph" w:styleId="Heading2">
     <w:name w:val="heading 2"/>
     <w:basedOn w:val="Normal"/>
     <w:next w:val="Normal"/>
-    <w:link w:val="Ttulo2Car"/>
+    <w:link w:val="Heading2Char"/>
     <w:uiPriority w:val="9"/>
     <w:unhideWhenUsed/>
     <w:qFormat/>
@@ -1256,11 +1158,11 @@
       <w:szCs w:val="32"/>
     </w:rPr>
   </w:style>
-  <w:style w:type="paragraph" w:styleId="Ttulo3">
+  <w:style w:type="paragraph" w:styleId="Heading3">
     <w:name w:val="heading 3"/>
     <w:basedOn w:val="Normal"/>
     <w:next w:val="Normal"/>
-    <w:link w:val="Ttulo3Car"/>
+    <w:link w:val="Heading3Char"/>
     <w:uiPriority w:val="9"/>
     <w:unhideWhenUsed/>
     <w:qFormat/>
@@ -1278,11 +1180,11 @@
       <w:szCs w:val="28"/>
     </w:rPr>
   </w:style>
-  <w:style w:type="paragraph" w:styleId="Ttulo4">
+  <w:style w:type="paragraph" w:styleId="Heading4">
     <w:name w:val="heading 4"/>
     <w:basedOn w:val="Normal"/>
     <w:next w:val="Normal"/>
-    <w:link w:val="Ttulo4Car"/>
+    <w:link w:val="Heading4Char"/>
     <w:uiPriority w:val="9"/>
     <w:semiHidden/>
     <w:unhideWhenUsed/>
@@ -1301,11 +1203,11 @@
       <w:color w:val="0F4761" w:themeColor="accent1" w:themeShade="BF"/>
     </w:rPr>
   </w:style>
-  <w:style w:type="paragraph" w:styleId="Ttulo5">
+  <w:style w:type="paragraph" w:styleId="Heading5">
     <w:name w:val="heading 5"/>
     <w:basedOn w:val="Normal"/>
     <w:next w:val="Normal"/>
-    <w:link w:val="Ttulo5Car"/>
+    <w:link w:val="Heading5Char"/>
     <w:uiPriority w:val="9"/>
     <w:semiHidden/>
     <w:unhideWhenUsed/>
@@ -1322,11 +1224,11 @@
       <w:color w:val="0F4761" w:themeColor="accent1" w:themeShade="BF"/>
     </w:rPr>
   </w:style>
-  <w:style w:type="paragraph" w:styleId="Ttulo6">
+  <w:style w:type="paragraph" w:styleId="Heading6">
     <w:name w:val="heading 6"/>
     <w:basedOn w:val="Normal"/>
     <w:next w:val="Normal"/>
-    <w:link w:val="Ttulo6Car"/>
+    <w:link w:val="Heading6Char"/>
     <w:uiPriority w:val="9"/>
     <w:semiHidden/>
     <w:unhideWhenUsed/>
@@ -1345,11 +1247,11 @@
       <w:color w:val="595959" w:themeColor="text1" w:themeTint="A6"/>
     </w:rPr>
   </w:style>
-  <w:style w:type="paragraph" w:styleId="Ttulo7">
+  <w:style w:type="paragraph" w:styleId="Heading7">
     <w:name w:val="heading 7"/>
     <w:basedOn w:val="Normal"/>
     <w:next w:val="Normal"/>
-    <w:link w:val="Ttulo7Car"/>
+    <w:link w:val="Heading7Char"/>
     <w:uiPriority w:val="9"/>
     <w:semiHidden/>
     <w:unhideWhenUsed/>
@@ -1366,11 +1268,11 @@
       <w:color w:val="595959" w:themeColor="text1" w:themeTint="A6"/>
     </w:rPr>
   </w:style>
-  <w:style w:type="paragraph" w:styleId="Ttulo8">
+  <w:style w:type="paragraph" w:styleId="Heading8">
     <w:name w:val="heading 8"/>
     <w:basedOn w:val="Normal"/>
     <w:next w:val="Normal"/>
-    <w:link w:val="Ttulo8Car"/>
+    <w:link w:val="Heading8Char"/>
     <w:uiPriority w:val="9"/>
     <w:semiHidden/>
     <w:unhideWhenUsed/>
@@ -1389,11 +1291,11 @@
       <w:color w:val="272727" w:themeColor="text1" w:themeTint="D8"/>
     </w:rPr>
   </w:style>
-  <w:style w:type="paragraph" w:styleId="Ttulo9">
+  <w:style w:type="paragraph" w:styleId="Heading9">
     <w:name w:val="heading 9"/>
     <w:basedOn w:val="Normal"/>
     <w:next w:val="Normal"/>
-    <w:link w:val="Ttulo9Car"/>
+    <w:link w:val="Heading9Char"/>
     <w:uiPriority w:val="9"/>
     <w:semiHidden/>
     <w:unhideWhenUsed/>
@@ -1410,12 +1312,13 @@
       <w:color w:val="272727" w:themeColor="text1" w:themeTint="D8"/>
     </w:rPr>
   </w:style>
-  <w:style w:type="character" w:default="1" w:styleId="Fuentedeprrafopredeter">
+  <w:style w:type="character" w:default="1" w:styleId="DefaultParagraphFont">
     <w:name w:val="Default Paragraph Font"/>
     <w:uiPriority w:val="1"/>
+    <w:semiHidden/>
     <w:unhideWhenUsed/>
   </w:style>
-  <w:style w:type="table" w:default="1" w:styleId="Tablanormal">
+  <w:style w:type="table" w:default="1" w:styleId="TableNormal">
     <w:name w:val="Normal Table"/>
     <w:uiPriority w:val="99"/>
     <w:semiHidden/>
@@ -1430,16 +1333,16 @@
       </w:tblCellMar>
     </w:tblPr>
   </w:style>
-  <w:style w:type="numbering" w:default="1" w:styleId="Sinlista">
+  <w:style w:type="numbering" w:default="1" w:styleId="NoList">
     <w:name w:val="No List"/>
     <w:uiPriority w:val="99"/>
     <w:semiHidden/>
     <w:unhideWhenUsed/>
   </w:style>
-  <w:style w:type="character" w:customStyle="1" w:styleId="Ttulo1Car">
-    <w:name w:val="Título 1 Car"/>
-    <w:basedOn w:val="Fuentedeprrafopredeter"/>
-    <w:link w:val="Ttulo1"/>
+  <w:style w:type="character" w:customStyle="1" w:styleId="Heading1Char">
+    <w:name w:val="Heading 1 Char"/>
+    <w:basedOn w:val="DefaultParagraphFont"/>
+    <w:link w:val="Heading1"/>
     <w:uiPriority w:val="9"/>
     <w:rsid w:val="00976E20"/>
     <w:rPr>
@@ -1449,10 +1352,10 @@
       <w:szCs w:val="40"/>
     </w:rPr>
   </w:style>
-  <w:style w:type="character" w:customStyle="1" w:styleId="Ttulo2Car">
-    <w:name w:val="Título 2 Car"/>
-    <w:basedOn w:val="Fuentedeprrafopredeter"/>
-    <w:link w:val="Ttulo2"/>
+  <w:style w:type="character" w:customStyle="1" w:styleId="Heading2Char">
+    <w:name w:val="Heading 2 Char"/>
+    <w:basedOn w:val="DefaultParagraphFont"/>
+    <w:link w:val="Heading2"/>
     <w:uiPriority w:val="9"/>
     <w:rsid w:val="00976E20"/>
     <w:rPr>
@@ -1462,10 +1365,10 @@
       <w:szCs w:val="32"/>
     </w:rPr>
   </w:style>
-  <w:style w:type="character" w:customStyle="1" w:styleId="Ttulo3Car">
-    <w:name w:val="Título 3 Car"/>
-    <w:basedOn w:val="Fuentedeprrafopredeter"/>
-    <w:link w:val="Ttulo3"/>
+  <w:style w:type="character" w:customStyle="1" w:styleId="Heading3Char">
+    <w:name w:val="Heading 3 Char"/>
+    <w:basedOn w:val="DefaultParagraphFont"/>
+    <w:link w:val="Heading3"/>
     <w:uiPriority w:val="9"/>
     <w:rsid w:val="00976E20"/>
     <w:rPr>
@@ -1475,10 +1378,10 @@
       <w:szCs w:val="28"/>
     </w:rPr>
   </w:style>
-  <w:style w:type="character" w:customStyle="1" w:styleId="Ttulo4Car">
-    <w:name w:val="Título 4 Car"/>
-    <w:basedOn w:val="Fuentedeprrafopredeter"/>
-    <w:link w:val="Ttulo4"/>
+  <w:style w:type="character" w:customStyle="1" w:styleId="Heading4Char">
+    <w:name w:val="Heading 4 Char"/>
+    <w:basedOn w:val="DefaultParagraphFont"/>
+    <w:link w:val="Heading4"/>
     <w:uiPriority w:val="9"/>
     <w:semiHidden/>
     <w:rsid w:val="00976E20"/>
@@ -1489,10 +1392,10 @@
       <w:color w:val="0F4761" w:themeColor="accent1" w:themeShade="BF"/>
     </w:rPr>
   </w:style>
-  <w:style w:type="character" w:customStyle="1" w:styleId="Ttulo5Car">
-    <w:name w:val="Título 5 Car"/>
-    <w:basedOn w:val="Fuentedeprrafopredeter"/>
-    <w:link w:val="Ttulo5"/>
+  <w:style w:type="character" w:customStyle="1" w:styleId="Heading5Char">
+    <w:name w:val="Heading 5 Char"/>
+    <w:basedOn w:val="DefaultParagraphFont"/>
+    <w:link w:val="Heading5"/>
     <w:uiPriority w:val="9"/>
     <w:semiHidden/>
     <w:rsid w:val="00976E20"/>
@@ -1501,10 +1404,10 @@
       <w:color w:val="0F4761" w:themeColor="accent1" w:themeShade="BF"/>
     </w:rPr>
   </w:style>
-  <w:style w:type="character" w:customStyle="1" w:styleId="Ttulo6Car">
-    <w:name w:val="Título 6 Car"/>
-    <w:basedOn w:val="Fuentedeprrafopredeter"/>
-    <w:link w:val="Ttulo6"/>
+  <w:style w:type="character" w:customStyle="1" w:styleId="Heading6Char">
+    <w:name w:val="Heading 6 Char"/>
+    <w:basedOn w:val="DefaultParagraphFont"/>
+    <w:link w:val="Heading6"/>
     <w:uiPriority w:val="9"/>
     <w:semiHidden/>
     <w:rsid w:val="00976E20"/>
@@ -1515,10 +1418,10 @@
       <w:color w:val="595959" w:themeColor="text1" w:themeTint="A6"/>
     </w:rPr>
   </w:style>
-  <w:style w:type="character" w:customStyle="1" w:styleId="Ttulo7Car">
-    <w:name w:val="Título 7 Car"/>
-    <w:basedOn w:val="Fuentedeprrafopredeter"/>
-    <w:link w:val="Ttulo7"/>
+  <w:style w:type="character" w:customStyle="1" w:styleId="Heading7Char">
+    <w:name w:val="Heading 7 Char"/>
+    <w:basedOn w:val="DefaultParagraphFont"/>
+    <w:link w:val="Heading7"/>
     <w:uiPriority w:val="9"/>
     <w:semiHidden/>
     <w:rsid w:val="00976E20"/>
@@ -1527,10 +1430,10 @@
       <w:color w:val="595959" w:themeColor="text1" w:themeTint="A6"/>
     </w:rPr>
   </w:style>
-  <w:style w:type="character" w:customStyle="1" w:styleId="Ttulo8Car">
-    <w:name w:val="Título 8 Car"/>
-    <w:basedOn w:val="Fuentedeprrafopredeter"/>
-    <w:link w:val="Ttulo8"/>
+  <w:style w:type="character" w:customStyle="1" w:styleId="Heading8Char">
+    <w:name w:val="Heading 8 Char"/>
+    <w:basedOn w:val="DefaultParagraphFont"/>
+    <w:link w:val="Heading8"/>
     <w:uiPriority w:val="9"/>
     <w:semiHidden/>
     <w:rsid w:val="00976E20"/>
@@ -1541,10 +1444,10 @@
       <w:color w:val="272727" w:themeColor="text1" w:themeTint="D8"/>
     </w:rPr>
   </w:style>
-  <w:style w:type="character" w:customStyle="1" w:styleId="Ttulo9Car">
-    <w:name w:val="Título 9 Car"/>
-    <w:basedOn w:val="Fuentedeprrafopredeter"/>
-    <w:link w:val="Ttulo9"/>
+  <w:style w:type="character" w:customStyle="1" w:styleId="Heading9Char">
+    <w:name w:val="Heading 9 Char"/>
+    <w:basedOn w:val="DefaultParagraphFont"/>
+    <w:link w:val="Heading9"/>
     <w:uiPriority w:val="9"/>
     <w:semiHidden/>
     <w:rsid w:val="00976E20"/>
@@ -1553,11 +1456,11 @@
       <w:color w:val="272727" w:themeColor="text1" w:themeTint="D8"/>
     </w:rPr>
   </w:style>
-  <w:style w:type="paragraph" w:styleId="Ttulo">
+  <w:style w:type="paragraph" w:styleId="Title">
     <w:name w:val="Title"/>
     <w:basedOn w:val="Normal"/>
     <w:next w:val="Normal"/>
-    <w:link w:val="TtuloCar"/>
+    <w:link w:val="TitleChar"/>
     <w:uiPriority w:val="10"/>
     <w:qFormat/>
     <w:rsid w:val="00976E20"/>
@@ -1573,10 +1476,10 @@
       <w:szCs w:val="56"/>
     </w:rPr>
   </w:style>
-  <w:style w:type="character" w:customStyle="1" w:styleId="TtuloCar">
-    <w:name w:val="Título Car"/>
-    <w:basedOn w:val="Fuentedeprrafopredeter"/>
-    <w:link w:val="Ttulo"/>
+  <w:style w:type="character" w:customStyle="1" w:styleId="TitleChar">
+    <w:name w:val="Title Char"/>
+    <w:basedOn w:val="DefaultParagraphFont"/>
+    <w:link w:val="Title"/>
     <w:uiPriority w:val="10"/>
     <w:rsid w:val="00976E20"/>
     <w:rPr>
@@ -1587,11 +1490,11 @@
       <w:szCs w:val="56"/>
     </w:rPr>
   </w:style>
-  <w:style w:type="paragraph" w:styleId="Subttulo">
+  <w:style w:type="paragraph" w:styleId="Subtitle">
     <w:name w:val="Subtitle"/>
     <w:basedOn w:val="Normal"/>
     <w:next w:val="Normal"/>
-    <w:link w:val="SubttuloCar"/>
+    <w:link w:val="SubtitleChar"/>
     <w:uiPriority w:val="11"/>
     <w:qFormat/>
     <w:rsid w:val="00976E20"/>
@@ -1608,10 +1511,10 @@
       <w:szCs w:val="28"/>
     </w:rPr>
   </w:style>
-  <w:style w:type="character" w:customStyle="1" w:styleId="SubttuloCar">
-    <w:name w:val="Subtítulo Car"/>
-    <w:basedOn w:val="Fuentedeprrafopredeter"/>
-    <w:link w:val="Subttulo"/>
+  <w:style w:type="character" w:customStyle="1" w:styleId="SubtitleChar">
+    <w:name w:val="Subtitle Char"/>
+    <w:basedOn w:val="DefaultParagraphFont"/>
+    <w:link w:val="Subtitle"/>
     <w:uiPriority w:val="11"/>
     <w:rsid w:val="00976E20"/>
     <w:rPr>
@@ -1622,11 +1525,11 @@
       <w:szCs w:val="28"/>
     </w:rPr>
   </w:style>
-  <w:style w:type="paragraph" w:styleId="Cita">
+  <w:style w:type="paragraph" w:styleId="Quote">
     <w:name w:val="Quote"/>
     <w:basedOn w:val="Normal"/>
     <w:next w:val="Normal"/>
-    <w:link w:val="CitaCar"/>
+    <w:link w:val="QuoteChar"/>
     <w:uiPriority w:val="29"/>
     <w:qFormat/>
     <w:rsid w:val="00976E20"/>
@@ -1640,10 +1543,10 @@
       <w:color w:val="404040" w:themeColor="text1" w:themeTint="BF"/>
     </w:rPr>
   </w:style>
-  <w:style w:type="character" w:customStyle="1" w:styleId="CitaCar">
-    <w:name w:val="Cita Car"/>
-    <w:basedOn w:val="Fuentedeprrafopredeter"/>
-    <w:link w:val="Cita"/>
+  <w:style w:type="character" w:customStyle="1" w:styleId="QuoteChar">
+    <w:name w:val="Quote Char"/>
+    <w:basedOn w:val="DefaultParagraphFont"/>
+    <w:link w:val="Quote"/>
     <w:uiPriority w:val="29"/>
     <w:rsid w:val="00976E20"/>
     <w:rPr>
@@ -1652,7 +1555,7 @@
       <w:color w:val="404040" w:themeColor="text1" w:themeTint="BF"/>
     </w:rPr>
   </w:style>
-  <w:style w:type="paragraph" w:styleId="Prrafodelista">
+  <w:style w:type="paragraph" w:styleId="ListParagraph">
     <w:name w:val="List Paragraph"/>
     <w:basedOn w:val="Normal"/>
     <w:uiPriority w:val="34"/>
@@ -1663,9 +1566,9 @@
       <w:contextualSpacing/>
     </w:pPr>
   </w:style>
-  <w:style w:type="character" w:styleId="nfasisintenso">
+  <w:style w:type="character" w:styleId="IntenseEmphasis">
     <w:name w:val="Intense Emphasis"/>
-    <w:basedOn w:val="Fuentedeprrafopredeter"/>
+    <w:basedOn w:val="DefaultParagraphFont"/>
     <w:uiPriority w:val="21"/>
     <w:qFormat/>
     <w:rsid w:val="00976E20"/>
@@ -1675,11 +1578,11 @@
       <w:color w:val="0F4761" w:themeColor="accent1" w:themeShade="BF"/>
     </w:rPr>
   </w:style>
-  <w:style w:type="paragraph" w:styleId="Citadestacada">
+  <w:style w:type="paragraph" w:styleId="IntenseQuote">
     <w:name w:val="Intense Quote"/>
     <w:basedOn w:val="Normal"/>
     <w:next w:val="Normal"/>
-    <w:link w:val="CitadestacadaCar"/>
+    <w:link w:val="IntenseQuoteChar"/>
     <w:uiPriority w:val="30"/>
     <w:qFormat/>
     <w:rsid w:val="00976E20"/>
@@ -1698,10 +1601,10 @@
       <w:color w:val="0F4761" w:themeColor="accent1" w:themeShade="BF"/>
     </w:rPr>
   </w:style>
-  <w:style w:type="character" w:customStyle="1" w:styleId="CitadestacadaCar">
-    <w:name w:val="Cita destacada Car"/>
-    <w:basedOn w:val="Fuentedeprrafopredeter"/>
-    <w:link w:val="Citadestacada"/>
+  <w:style w:type="character" w:customStyle="1" w:styleId="IntenseQuoteChar">
+    <w:name w:val="Intense Quote Char"/>
+    <w:basedOn w:val="DefaultParagraphFont"/>
+    <w:link w:val="IntenseQuote"/>
     <w:uiPriority w:val="30"/>
     <w:rsid w:val="00976E20"/>
     <w:rPr>
@@ -1710,9 +1613,9 @@
       <w:color w:val="0F4761" w:themeColor="accent1" w:themeShade="BF"/>
     </w:rPr>
   </w:style>
-  <w:style w:type="character" w:styleId="Referenciaintensa">
+  <w:style w:type="character" w:styleId="IntenseReference">
     <w:name w:val="Intense Reference"/>
-    <w:basedOn w:val="Fuentedeprrafopredeter"/>
+    <w:basedOn w:val="DefaultParagraphFont"/>
     <w:uiPriority w:val="32"/>
     <w:qFormat/>
     <w:rsid w:val="00976E20"/>

</xml_diff>